<commit_message>
Add QQQ weekend forecasting baseline and SARIMAX
</commit_message>
<xml_diff>
--- a/Time_Series_Challenge_Proposal_Balz_Binkert_simplified.docx
+++ b/Time_Series_Challenge_Proposal_Balz_Binkert_simplified.docx
@@ -48,7 +48,7 @@
         </w:rPr>
       </w:pPr>
       <w:r>
-        <w:t>Project Title: Forecasting Bitcoin Realized Volatility</w:t>
+        <w:t>Project Title: Forecasting QQQ Opening Gaps from Bitcoin Weekend Activity</w:t>
       </w:r>
     </w:p>
     <w:p>
@@ -78,7 +78,7 @@
         </w:rPr>
       </w:pPr>
       <w:r>
-        <w:t>Project Objectives: Predict future Bitcoin volatility and compare simple baselines, classical models, and one modern foundation model.</w:t>
+        <w:t>Project Objectives: Test whether Bitcoin weekend activity improves forecasts of the next QQQ opening gap and compare classical and foundation models.</w:t>
       </w:r>
     </w:p>
     <w:p>
@@ -93,7 +93,7 @@
         </w:rPr>
       </w:pPr>
       <w:r>
-        <w:t>Brief Description of the Time Series Challenge: We forecast future 7-day realized volatility from BTC log returns. The focus is forecasting quality, not trading profitability.</w:t>
+        <w:t>Brief Description of the Time Series Challenge: Using information available by Sunday night, we forecast the log return from Friday QQQ close to Monday open. Direction is derived from the numerical forecast.</w:t>
       </w:r>
     </w:p>
     <w:p>
@@ -129,7 +129,7 @@
         </w:rPr>
       </w:pPr>
       <w:r>
-        <w:t>Data Source(s): BTC-USD OHLCV from Yahoo Finance/yfinance, plus Fear &amp; Greed Index, VIX, DXY and Nasdaq as external market indicators.</w:t>
+        <w:t>Data Source(s): Hourly Bitcoin OHLCV from the Binance public archive; QQQ, VIX and DXY from Yahoo Finance/yfinance; Fear &amp; Greed Index from Alternative.me.</w:t>
       </w:r>
     </w:p>
     <w:p>
@@ -143,7 +143,7 @@
         </w:rPr>
       </w:pPr>
       <w:r>
-        <w:t>Data Description (multi-timeseries, features, etc.): Daily BTC time series with log returns, volume, rolling volatility, lagged volatility, selected technical indicators, Fear &amp; Greed, VIX, DXY and Nasdaq features.</w:t>
+        <w:t>Data Description (multi-timeseries, features, etc.): One row per regular weekend and Monday session, combining Bitcoin weekend features with QQQ history, Fear &amp; Greed, VIX and DXY.</w:t>
       </w:r>
     </w:p>
     <w:p>
@@ -178,7 +178,7 @@
         </w:rPr>
       </w:pPr>
       <w:r>
-        <w:t>Model Selection to compare (i.e. classical vs. modern): Naive persistence/window average; GARCH as classical volatility model; XGBoost as ML baseline; Chronos-2 as advanced foundation model.</w:t>
+        <w:t>Model Selection to compare (i.e. classical vs. modern): Zero-gap and historical-mean baselines; SARIMAX as a classical statistical model; XGBoost as a classical ML model; Chronos-2 as a time-series foundation model.</w:t>
       </w:r>
     </w:p>
     <w:p>
@@ -192,7 +192,7 @@
         </w:rPr>
       </w:pPr>
       <w:r>
-        <w:t>Training Process (e.g. cluster or local): Baselines, GARCH and XGBoost run locally. Chronos-2 is used pretrained/zero-shot, locally or in Colab if needed.</w:t>
+        <w:t>Training Process (e.g. cluster or local): Models run locally. Chronos-2 is used pretrained/zero-shot with Apple-Silicon MPS support and CPU fallback.</w:t>
       </w:r>
     </w:p>
     <w:p>
@@ -206,7 +206,7 @@
         </w:rPr>
       </w:pPr>
       <w:r>
-        <w:t>Data split: Walk-forward backtesting with chronological folds, plus a final recent holdout period.</w:t>
+        <w:t>Data split: Expanding-window time-series cross-validation on 2018-2024, plus an untouched holdout from 2025 onward.</w:t>
       </w:r>
     </w:p>
     <w:p>
@@ -241,7 +241,7 @@
         </w:rPr>
       </w:pPr>
       <w:r>
-        <w:t>Performance Metrics (e.g., Accuracy, Precision, Recall, F1-score): MAE and RMSE for realized volatility; relative performance versus naive persistence.</w:t>
+        <w:t>Performance Metrics (e.g., Accuracy, Precision, Recall, F1-score): MAE for the QQQ opening gap and directional accuracy for rise/fall, compared with simple baselines.</w:t>
       </w:r>
     </w:p>
     <w:p>
@@ -255,7 +255,7 @@
         </w:rPr>
       </w:pPr>
       <w:r>
-        <w:t>Cross-validation Strategy: Time-series cross-validation. Each fold trains only on past data and predicts the next non-overlapping 7-day horizon.</w:t>
+        <w:t>Cross-validation Strategy: Expanding-window validation. Each fold trains on earlier weekends and predicts later Monday opening gaps.</w:t>
       </w:r>
     </w:p>
     <w:p>
@@ -269,7 +269,7 @@
         </w:rPr>
       </w:pPr>
       <w:r>
-        <w:t>Model Comparison: Compare backtest error, holdout error, interpretability and implementation effort.</w:t>
+        <w:t>Model Comparison: Compare the same dates and test the added value of Bitcoin weekend features; also discuss interpretability and implementation effort.</w:t>
       </w:r>
     </w:p>
     <w:p>
@@ -304,7 +304,7 @@
         </w:rPr>
       </w:pPr>
       <w:r>
-        <w:t>Academic Papers: Engle (1982) ARCH; Bollerslev (1986) GARCH; Hyndman &amp; Athanasopoulos; Chronos/Chronos-2 papers.</w:t>
+        <w:t>Academic Papers: Hyndman &amp; Athanasopoulos; XGBoost; Chronos/Chronos-2; recent research on predicting Monday stock returns from weekend cryptocurrency returns.</w:t>
       </w:r>
     </w:p>
     <w:p>
@@ -318,7 +318,7 @@
         </w:rPr>
       </w:pPr>
       <w:r>
-        <w:t>Datasets: Yahoo Finance/yfinance BTC-USD; Alternative.me Fear &amp; Greed Index; VIX, DXY and Nasdaq market data.</w:t>
+        <w:t>Datasets: Binance public Bitcoin archive; Yahoo Finance/yfinance QQQ, VIX and DXY; Alternative.me Fear &amp; Greed Index.</w:t>
       </w:r>
     </w:p>
     <w:p>
@@ -332,7 +332,7 @@
         </w:rPr>
       </w:pPr>
       <w:r>
-        <w:t>Tools and Libraries Used: pandas, yfinance, statsmodels/arch, XGBoost, scikit-learn, Chronos-2. Sources also include Marco Peixeiro notebook and MachineLearningMastery overview.</w:t>
+        <w:t>Tools and Libraries Used: pandas, yfinance, statsmodels, XGBoost, scikit-learn and Chronos-2. Sources also include Marco Peixeiro's forecasting notebook and the MachineLearningMastery time-series foundation-model overview.</w:t>
       </w:r>
     </w:p>
     <w:p>

</xml_diff>

<commit_message>
Reframe QQQ forecasting and add majority baseline
</commit_message>
<xml_diff>
--- a/Time_Series_Challenge_Proposal_Balz_Binkert_simplified.docx
+++ b/Time_Series_Challenge_Proposal_Balz_Binkert_simplified.docx
@@ -48,7 +48,7 @@
         </w:rPr>
       </w:pPr>
       <w:r>
-        <w:t>Project Title: Forecasting QQQ Opening Gaps from Bitcoin Weekend Activity</w:t>
+        <w:t>Project Title: Forecasting QQQ Opening-Gap Direction from Bitcoin Overnight Activity</w:t>
       </w:r>
     </w:p>
     <w:p>
@@ -78,7 +78,7 @@
         </w:rPr>
       </w:pPr>
       <w:r>
-        <w:t>Project Objectives: Test whether Bitcoin weekend activity improves forecasts of the next QQQ opening gap and compare classical and foundation models.</w:t>
+        <w:t>Project Objectives: Test whether Bitcoin activity outside regular US trading hours adds predictive information for the direction of the next QQQ opening gap.</w:t>
       </w:r>
     </w:p>
     <w:p>
@@ -93,7 +93,7 @@
         </w:rPr>
       </w:pPr>
       <w:r>
-        <w:t>Brief Description of the Time Series Challenge: Using information available by Sunday night, we forecast the log return from Friday QQQ close to Monday open. Direction is derived from the numerical forecast.</w:t>
+        <w:t>Brief Description of the Time Series Challenge: For every QQQ trading day, we use information available by 09:00 New York time to predict whether QQQ opens above or below the previous regular-session close.</w:t>
       </w:r>
     </w:p>
     <w:p>
@@ -129,7 +129,7 @@
         </w:rPr>
       </w:pPr>
       <w:r>
-        <w:t>Data Source(s): Hourly Bitcoin OHLCV from the Binance public archive; QQQ, VIX and DXY from Yahoo Finance/yfinance; Fear &amp; Greed Index from Alternative.me.</w:t>
+        <w:t>Data Source(s): Hourly Bitcoin OHLCV from the Binance public archive; QQQ, VIX and DXY from Yahoo Finance/yfinance; Fear &amp; Greed from Alternative.me; Nasdaq sessions from exchange_calendars.</w:t>
       </w:r>
     </w:p>
     <w:p>
@@ -143,7 +143,7 @@
         </w:rPr>
       </w:pPr>
       <w:r>
-        <w:t>Data Description (multi-timeseries, features, etc.): One row per regular weekend and Monday session, combining Bitcoin weekend features with QQQ history, Fear &amp; Greed, VIX and DXY.</w:t>
+        <w:t>Data Description (multi-timeseries, features, etc.): One row per QQQ trading day, combining the previous QQQ session, Bitcoin activity until 09:00, sentiment, VIX, DXY and calendar information.</w:t>
       </w:r>
     </w:p>
     <w:p>
@@ -178,7 +178,7 @@
         </w:rPr>
       </w:pPr>
       <w:r>
-        <w:t>Model Selection to compare (i.e. classical vs. modern): Zero-gap and historical-mean baselines; SARIMAX as a classical statistical model; XGBoost as a classical ML model; Chronos-2 as a time-series foundation model.</w:t>
+        <w:t>Model Selection to compare (i.e. classical vs. modern): Historical majority baseline; logistic regression as a simple statistical method; XGBoost as classical ML; Chronos-2 as a time-series foundation model.</w:t>
       </w:r>
     </w:p>
     <w:p>
@@ -192,7 +192,7 @@
         </w:rPr>
       </w:pPr>
       <w:r>
-        <w:t>Training Process (e.g. cluster or local): Models run locally. Chronos-2 is used pretrained/zero-shot with Apple-Silicon MPS support and CPU fallback.</w:t>
+        <w:t>Training Process (e.g. cluster or local): Models run locally. Chronos-2 is used pretrained with Apple-Silicon MPS support and CPU fallback.</w:t>
       </w:r>
     </w:p>
     <w:p>
@@ -206,7 +206,7 @@
         </w:rPr>
       </w:pPr>
       <w:r>
-        <w:t>Data split: Expanding-window time-series cross-validation on 2018-2024, plus an untouched holdout from 2025 onward.</w:t>
+        <w:t>Data split: Expanding-window time-series validation from 2021 to 2025 using earlier observations for training, plus an untouched 2026 holdout.</w:t>
       </w:r>
     </w:p>
     <w:p>
@@ -241,7 +241,7 @@
         </w:rPr>
       </w:pPr>
       <w:r>
-        <w:t>Performance Metrics (e.g., Accuracy, Precision, Recall, F1-score): MAE for the QQQ opening gap and directional accuracy for rise/fall, compared with simple baselines.</w:t>
+        <w:t>Performance Metrics (e.g., Accuracy, Precision, Recall, F1-score): Accuracy as the primary metric and balanced accuracy as a class-balance check; numerical gap MAE for Chronos-2.</w:t>
       </w:r>
     </w:p>
     <w:p>
@@ -255,7 +255,7 @@
         </w:rPr>
       </w:pPr>
       <w:r>
-        <w:t>Cross-validation Strategy: Expanding-window validation. Each fold trains on earlier weekends and predicts later Monday opening gaps.</w:t>
+        <w:t>Cross-validation Strategy: Expanding-window validation. Each fold trains on earlier trading days and predicts a later calendar year without random shuffling.</w:t>
       </w:r>
     </w:p>
     <w:p>
@@ -269,7 +269,7 @@
         </w:rPr>
       </w:pPr>
       <w:r>
-        <w:t>Model Comparison: Compare the same dates and test the added value of Bitcoin weekend features; also discuss interpretability and implementation effort.</w:t>
+        <w:t>Model Comparison: Compare identical forecast dates and matched model variants without and with Bitcoin features; report overall, yearly and Monday results.</w:t>
       </w:r>
     </w:p>
     <w:p>
@@ -304,7 +304,7 @@
         </w:rPr>
       </w:pPr>
       <w:r>
-        <w:t>Academic Papers: Hyndman &amp; Athanasopoulos; XGBoost; Chronos/Chronos-2; recent research on predicting Monday stock returns from weekend cryptocurrency returns.</w:t>
+        <w:t>Academic Papers: Hyndman &amp; Athanasopoulos; XGBoost; Chronos/Chronos-2; literature on crypto-equity connectedness and overnight forecasting.</w:t>
       </w:r>
     </w:p>
     <w:p>
@@ -318,7 +318,7 @@
         </w:rPr>
       </w:pPr>
       <w:r>
-        <w:t>Datasets: Binance public Bitcoin archive; Yahoo Finance/yfinance QQQ, VIX and DXY; Alternative.me Fear &amp; Greed Index.</w:t>
+        <w:t>Datasets: Binance public Bitcoin archive; Yahoo Finance/yfinance QQQ, VIX and DXY; Alternative.me Fear &amp; Greed Index; Nasdaq exchange calendar.</w:t>
       </w:r>
     </w:p>
     <w:p>
@@ -332,7 +332,7 @@
         </w:rPr>
       </w:pPr>
       <w:r>
-        <w:t>Tools and Libraries Used: pandas, yfinance, statsmodels, XGBoost, scikit-learn and Chronos-2. Sources also include Marco Peixeiro's forecasting notebook and the MachineLearningMastery time-series foundation-model overview.</w:t>
+        <w:t>Tools and Libraries Used: pandas, yfinance, exchange_calendars, scikit-learn, XGBoost and Chronos-2. Sources also include Marco Peixeiro's forecasting notebook and the MachineLearningMastery foundation-model overview.</w:t>
       </w:r>
     </w:p>
     <w:p>

</xml_diff>